<commit_message>
chore: update demo DOCX with improved formatting
Co-Authored-By: Claude Opus 4.6 <noreply@anthropic.com>
</commit_message>
<xml_diff>
--- a/examples/vite/public/docx-editor-demo.docx
+++ b/examples/vite/public/docx-editor-demo.docx
@@ -1018,15 +1018,15 @@
         </w:tblBorders>
       </w:tblPr>
       <w:tblGrid>
-        <w:gridCol w:w="2200"/>
-        <w:gridCol w:w="1400"/>
-        <w:gridCol w:w="800"/>
-        <w:gridCol w:w="4960"/>
+        <w:gridCol w:w="1885"/>
+        <w:gridCol w:w="1715"/>
+        <w:gridCol w:w="965"/>
+        <w:gridCol w:w="4795"/>
       </w:tblGrid>
       <w:tr>
         <w:tc>
           <w:tcPr>
-            <w:tcW w:w="24" w:type="pct"/>
+            <w:tcW w:w="1885" w:type="dxa"/>
             <w:tcBorders>
               <w:top w:val="single" w:sz="1" w:color="E2E8F0"/>
               <w:left w:val="single" w:sz="1" w:color="E2E8F0"/>
@@ -1060,7 +1060,7 @@
         </w:tc>
         <w:tc>
           <w:tcPr>
-            <w:tcW w:w="15" w:type="pct"/>
+            <w:tcW w:w="1715" w:type="dxa"/>
             <w:tcBorders>
               <w:top w:val="single" w:sz="1" w:color="E2E8F0"/>
               <w:left w:val="single" w:sz="1" w:color="E2E8F0"/>
@@ -1094,7 +1094,7 @@
         </w:tc>
         <w:tc>
           <w:tcPr>
-            <w:tcW w:w="9" w:type="pct"/>
+            <w:tcW w:w="965" w:type="dxa"/>
             <w:tcBorders>
               <w:top w:val="single" w:sz="1" w:color="E2E8F0"/>
               <w:left w:val="single" w:sz="1" w:color="E2E8F0"/>
@@ -1128,7 +1128,7 @@
         </w:tc>
         <w:tc>
           <w:tcPr>
-            <w:tcW w:w="53" w:type="pct"/>
+            <w:tcW w:w="4795" w:type="dxa"/>
             <w:tcBorders>
               <w:top w:val="single" w:sz="1" w:color="E2E8F0"/>
               <w:left w:val="single" w:sz="1" w:color="E2E8F0"/>
@@ -1164,7 +1164,7 @@
       <w:tr>
         <w:tc>
           <w:tcPr>
-            <w:tcW w:w="2200" w:type="dxa"/>
+            <w:tcW w:w="1885" w:type="dxa"/>
             <w:tcBorders>
               <w:top w:val="single" w:sz="1" w:color="E2E8F0"/>
               <w:left w:val="single" w:sz="1" w:color="E2E8F0"/>
@@ -1196,7 +1196,7 @@
         </w:tc>
         <w:tc>
           <w:tcPr>
-            <w:tcW w:w="1400" w:type="dxa"/>
+            <w:tcW w:w="1715" w:type="dxa"/>
             <w:tcBorders>
               <w:top w:val="single" w:sz="1" w:color="E2E8F0"/>
               <w:left w:val="single" w:sz="1" w:color="E2E8F0"/>
@@ -1228,7 +1228,7 @@
         </w:tc>
         <w:tc>
           <w:tcPr>
-            <w:tcW w:w="800" w:type="dxa"/>
+            <w:tcW w:w="965" w:type="dxa"/>
             <w:tcBorders>
               <w:top w:val="single" w:sz="1" w:color="E2E8F0"/>
               <w:left w:val="single" w:sz="1" w:color="E2E8F0"/>
@@ -1260,7 +1260,7 @@
         </w:tc>
         <w:tc>
           <w:tcPr>
-            <w:tcW w:w="4960" w:type="dxa"/>
+            <w:tcW w:w="4795" w:type="dxa"/>
             <w:tcBorders>
               <w:top w:val="single" w:sz="1" w:color="E2E8F0"/>
               <w:left w:val="single" w:sz="1" w:color="E2E8F0"/>
@@ -1294,7 +1294,7 @@
       <w:tr>
         <w:tc>
           <w:tcPr>
-            <w:tcW w:w="2200" w:type="dxa"/>
+            <w:tcW w:w="1885" w:type="dxa"/>
             <w:tcBorders>
               <w:top w:val="single" w:sz="1" w:color="E2E8F0"/>
               <w:left w:val="single" w:sz="1" w:color="E2E8F0"/>
@@ -1326,7 +1326,7 @@
         </w:tc>
         <w:tc>
           <w:tcPr>
-            <w:tcW w:w="1400" w:type="dxa"/>
+            <w:tcW w:w="1715" w:type="dxa"/>
             <w:tcBorders>
               <w:top w:val="single" w:sz="1" w:color="E2E8F0"/>
               <w:left w:val="single" w:sz="1" w:color="E2E8F0"/>
@@ -1358,7 +1358,7 @@
         </w:tc>
         <w:tc>
           <w:tcPr>
-            <w:tcW w:w="800" w:type="dxa"/>
+            <w:tcW w:w="965" w:type="dxa"/>
             <w:tcBorders>
               <w:top w:val="single" w:sz="1" w:color="E2E8F0"/>
               <w:left w:val="single" w:sz="1" w:color="E2E8F0"/>
@@ -1390,7 +1390,7 @@
         </w:tc>
         <w:tc>
           <w:tcPr>
-            <w:tcW w:w="4960" w:type="dxa"/>
+            <w:tcW w:w="4795" w:type="dxa"/>
             <w:tcBorders>
               <w:top w:val="single" w:sz="1" w:color="E2E8F0"/>
               <w:left w:val="single" w:sz="1" w:color="E2E8F0"/>
@@ -1424,7 +1424,7 @@
       <w:tr>
         <w:tc>
           <w:tcPr>
-            <w:tcW w:w="2200" w:type="dxa"/>
+            <w:tcW w:w="1885" w:type="dxa"/>
             <w:tcBorders>
               <w:top w:val="single" w:sz="1" w:color="E2E8F0"/>
               <w:left w:val="single" w:sz="1" w:color="E2E8F0"/>
@@ -1456,7 +1456,7 @@
         </w:tc>
         <w:tc>
           <w:tcPr>
-            <w:tcW w:w="1400" w:type="dxa"/>
+            <w:tcW w:w="1715" w:type="dxa"/>
             <w:tcBorders>
               <w:top w:val="single" w:sz="1" w:color="E2E8F0"/>
               <w:left w:val="single" w:sz="1" w:color="E2E8F0"/>
@@ -1488,7 +1488,7 @@
         </w:tc>
         <w:tc>
           <w:tcPr>
-            <w:tcW w:w="800" w:type="dxa"/>
+            <w:tcW w:w="965" w:type="dxa"/>
             <w:tcBorders>
               <w:top w:val="single" w:sz="1" w:color="E2E8F0"/>
               <w:left w:val="single" w:sz="1" w:color="E2E8F0"/>
@@ -1520,7 +1520,7 @@
         </w:tc>
         <w:tc>
           <w:tcPr>
-            <w:tcW w:w="4960" w:type="dxa"/>
+            <w:tcW w:w="4795" w:type="dxa"/>
             <w:tcBorders>
               <w:top w:val="single" w:sz="1" w:color="E2E8F0"/>
               <w:left w:val="single" w:sz="1" w:color="E2E8F0"/>
@@ -1554,7 +1554,7 @@
       <w:tr>
         <w:tc>
           <w:tcPr>
-            <w:tcW w:w="2200" w:type="dxa"/>
+            <w:tcW w:w="1885" w:type="dxa"/>
             <w:tcBorders>
               <w:top w:val="single" w:sz="1" w:color="E2E8F0"/>
               <w:left w:val="single" w:sz="1" w:color="E2E8F0"/>
@@ -1586,7 +1586,7 @@
         </w:tc>
         <w:tc>
           <w:tcPr>
-            <w:tcW w:w="1400" w:type="dxa"/>
+            <w:tcW w:w="1715" w:type="dxa"/>
             <w:tcBorders>
               <w:top w:val="single" w:sz="1" w:color="E2E8F0"/>
               <w:left w:val="single" w:sz="1" w:color="E2E8F0"/>
@@ -1618,7 +1618,7 @@
         </w:tc>
         <w:tc>
           <w:tcPr>
-            <w:tcW w:w="800" w:type="dxa"/>
+            <w:tcW w:w="965" w:type="dxa"/>
             <w:tcBorders>
               <w:top w:val="single" w:sz="1" w:color="E2E8F0"/>
               <w:left w:val="single" w:sz="1" w:color="E2E8F0"/>
@@ -1650,7 +1650,7 @@
         </w:tc>
         <w:tc>
           <w:tcPr>
-            <w:tcW w:w="4960" w:type="dxa"/>
+            <w:tcW w:w="4795" w:type="dxa"/>
             <w:tcBorders>
               <w:top w:val="single" w:sz="1" w:color="E2E8F0"/>
               <w:left w:val="single" w:sz="1" w:color="E2E8F0"/>
@@ -1684,7 +1684,7 @@
       <w:tr>
         <w:tc>
           <w:tcPr>
-            <w:tcW w:w="2200" w:type="dxa"/>
+            <w:tcW w:w="1885" w:type="dxa"/>
             <w:tcBorders>
               <w:top w:val="single" w:sz="1" w:color="E2E8F0"/>
               <w:left w:val="single" w:sz="1" w:color="E2E8F0"/>
@@ -1716,7 +1716,7 @@
         </w:tc>
         <w:tc>
           <w:tcPr>
-            <w:tcW w:w="1400" w:type="dxa"/>
+            <w:tcW w:w="1715" w:type="dxa"/>
             <w:tcBorders>
               <w:top w:val="single" w:sz="1" w:color="E2E8F0"/>
               <w:left w:val="single" w:sz="1" w:color="E2E8F0"/>
@@ -1748,7 +1748,7 @@
         </w:tc>
         <w:tc>
           <w:tcPr>
-            <w:tcW w:w="800" w:type="dxa"/>
+            <w:tcW w:w="965" w:type="dxa"/>
             <w:tcBorders>
               <w:top w:val="single" w:sz="1" w:color="E2E8F0"/>
               <w:left w:val="single" w:sz="1" w:color="E2E8F0"/>
@@ -1780,7 +1780,7 @@
         </w:tc>
         <w:tc>
           <w:tcPr>
-            <w:tcW w:w="4960" w:type="dxa"/>
+            <w:tcW w:w="4795" w:type="dxa"/>
             <w:tcBorders>
               <w:top w:val="single" w:sz="1" w:color="E2E8F0"/>
               <w:left w:val="single" w:sz="1" w:color="E2E8F0"/>
@@ -1814,7 +1814,7 @@
       <w:tr>
         <w:tc>
           <w:tcPr>
-            <w:tcW w:w="2200" w:type="dxa"/>
+            <w:tcW w:w="1885" w:type="dxa"/>
             <w:tcBorders>
               <w:top w:val="single" w:sz="1" w:color="E2E8F0"/>
               <w:left w:val="single" w:sz="1" w:color="E2E8F0"/>
@@ -1846,7 +1846,7 @@
         </w:tc>
         <w:tc>
           <w:tcPr>
-            <w:tcW w:w="1400" w:type="dxa"/>
+            <w:tcW w:w="1715" w:type="dxa"/>
             <w:tcBorders>
               <w:top w:val="single" w:sz="1" w:color="E2E8F0"/>
               <w:left w:val="single" w:sz="1" w:color="E2E8F0"/>
@@ -1878,7 +1878,7 @@
         </w:tc>
         <w:tc>
           <w:tcPr>
-            <w:tcW w:w="800" w:type="dxa"/>
+            <w:tcW w:w="965" w:type="dxa"/>
             <w:tcBorders>
               <w:top w:val="single" w:sz="1" w:color="E2E8F0"/>
               <w:left w:val="single" w:sz="1" w:color="E2E8F0"/>
@@ -1910,7 +1910,7 @@
         </w:tc>
         <w:tc>
           <w:tcPr>
-            <w:tcW w:w="4960" w:type="dxa"/>
+            <w:tcW w:w="4795" w:type="dxa"/>
             <w:tcBorders>
               <w:top w:val="single" w:sz="1" w:color="E2E8F0"/>
               <w:left w:val="single" w:sz="1" w:color="E2E8F0"/>
@@ -1944,7 +1944,7 @@
       <w:tr>
         <w:tc>
           <w:tcPr>
-            <w:tcW w:w="2200" w:type="dxa"/>
+            <w:tcW w:w="1885" w:type="dxa"/>
             <w:tcBorders>
               <w:top w:val="single" w:sz="1" w:color="E2E8F0"/>
               <w:left w:val="single" w:sz="1" w:color="E2E8F0"/>
@@ -1976,7 +1976,7 @@
         </w:tc>
         <w:tc>
           <w:tcPr>
-            <w:tcW w:w="1400" w:type="dxa"/>
+            <w:tcW w:w="1715" w:type="dxa"/>
             <w:tcBorders>
               <w:top w:val="single" w:sz="1" w:color="E2E8F0"/>
               <w:left w:val="single" w:sz="1" w:color="E2E8F0"/>
@@ -2008,7 +2008,7 @@
         </w:tc>
         <w:tc>
           <w:tcPr>
-            <w:tcW w:w="800" w:type="dxa"/>
+            <w:tcW w:w="965" w:type="dxa"/>
             <w:tcBorders>
               <w:top w:val="single" w:sz="1" w:color="E2E8F0"/>
               <w:left w:val="single" w:sz="1" w:color="E2E8F0"/>
@@ -2040,7 +2040,7 @@
         </w:tc>
         <w:tc>
           <w:tcPr>
-            <w:tcW w:w="4960" w:type="dxa"/>
+            <w:tcW w:w="4795" w:type="dxa"/>
             <w:tcBorders>
               <w:top w:val="single" w:sz="1" w:color="E2E8F0"/>
               <w:left w:val="single" w:sz="1" w:color="E2E8F0"/>
@@ -2075,6 +2075,21 @@
     <w:p>
       <w:pPr>
         <w:spacing w:before="80" w:after="0"/>
+      </w:pPr>
+    </w:p>
+    <w:p>
+      <w:pPr>
+        <w:spacing w:before="180" w:after="40"/>
+      </w:pPr>
+    </w:p>
+    <w:p>
+      <w:pPr>
+        <w:spacing w:before="180" w:after="40"/>
+      </w:pPr>
+    </w:p>
+    <w:p>
+      <w:pPr>
+        <w:spacing w:before="180" w:after="40"/>
       </w:pPr>
     </w:p>
     <w:p>
@@ -2561,6 +2576,12 @@
         <w:tc>
           <w:tcPr>
             <w:tcW w:w="4680" w:type="dxa"/>
+            <w:tcBorders>
+              <w:top w:val="single" w:sz="4" w:color="auto"/>
+              <w:left w:val="single" w:sz="4" w:color="auto"/>
+              <w:bottom w:val="single" w:sz="4" w:color="auto"/>
+              <w:right w:val="single" w:sz="4" w:color="auto"/>
+            </w:tcBorders>
             <w:tcMar>
               <w:top w:w="80" w:type="dxa"/>
               <w:left w:w="0" w:type="dxa"/>
@@ -2624,6 +2645,12 @@
         <w:tc>
           <w:tcPr>
             <w:tcW w:w="4680" w:type="dxa"/>
+            <w:tcBorders>
+              <w:top w:val="single" w:sz="4" w:color="auto"/>
+              <w:left w:val="single" w:sz="4" w:color="auto"/>
+              <w:bottom w:val="single" w:sz="4" w:color="auto"/>
+              <w:right w:val="single" w:sz="4" w:color="auto"/>
+            </w:tcBorders>
             <w:tcMar>
               <w:top w:w="80" w:type="dxa"/>
               <w:left w:w="200" w:type="dxa"/>

</xml_diff>

<commit_message>
docs: update demo docx file
Co-Authored-By: Claude Opus 4.6 <noreply@anthropic.com>
</commit_message>
<xml_diff>
--- a/examples/vite/public/docx-editor-demo.docx
+++ b/examples/vite/public/docx-editor-demo.docx
@@ -4,11 +4,6 @@
   <w:body>
     <w:p>
       <w:pPr>
-        <w:spacing w:before="0" w:after="0"/>
-      </w:pPr>
-    </w:p>
-    <w:p>
-      <w:pPr>
         <w:spacing w:before="0" w:after="20"/>
       </w:pPr>
       <w:r>
@@ -36,6 +31,11 @@
         </w:rPr>
         <w:t>Project Charter &amp; Contributor Agreement</w:t>
       </w:r>
+    </w:p>
+    <w:p>
+      <w:pPr>
+        <w:spacing w:after="60"/>
+      </w:pPr>
     </w:p>
     <w:tbl>
       <w:tblPr>
@@ -144,11 +144,6 @@
         </w:tc>
       </w:tr>
     </w:tbl>
-    <w:p>
-      <w:pPr>
-        <w:spacing w:before="160" w:after="0"/>
-      </w:pPr>
-    </w:p>
     <w:p>
       <w:pPr>
         <w:pBdr>
@@ -2078,19 +2073,9 @@
       </w:pPr>
     </w:p>
     <w:p>
-      <w:pPr>
-        <w:spacing w:before="180" w:after="40"/>
-      </w:pPr>
-    </w:p>
-    <w:p>
-      <w:pPr>
-        <w:spacing w:before="180" w:after="40"/>
-      </w:pPr>
-    </w:p>
-    <w:p>
-      <w:pPr>
-        <w:spacing w:before="180" w:after="40"/>
-      </w:pPr>
+      <w:r>
+        <w:br w:type="page"/>
+      </w:r>
     </w:p>
     <w:p>
       <w:pPr>
@@ -2829,7 +2814,7 @@
         <w:sz w:val="20"/>
         <w:szCs w:val="20"/>
       </w:rPr>
-      <w:instrText xml:space="preserve"> PAGE \* MERGEFORMAT </w:instrText>
+      <w:instrText>PAGE \* MERGEFORMAT</w:instrText>
     </w:r>
     <w:r>
       <w:rPr>
@@ -2883,7 +2868,7 @@
         <w:sz w:val="20"/>
         <w:szCs w:val="20"/>
       </w:rPr>
-      <w:instrText xml:space="preserve"> NUMPAGES \* MERGEFORMAT </w:instrText>
+      <w:instrText>NUMPAGES \* MERGEFORMAT</w:instrText>
     </w:r>
     <w:r>
       <w:rPr>

</xml_diff>

<commit_message>
fix: generate valid paraIds and re-save demo DOCX with commentsExtended
- Fix paraId generator to use unsigned 32-bit (>>> 0) for valid hex
- Re-save docx-editor-demo.docx so it includes commentsExtended.xml
  (fixes "From imported document" issue in Google Docs/Word/SuperDoc)

Co-Authored-By: Claude Opus 4.6 (1M context) <noreply@anthropic.com>
</commit_message>
<xml_diff>
--- a/examples/vite/public/docx-editor-demo.docx
+++ b/examples/vite/public/docx-editor-demo.docx
@@ -2710,7 +2710,7 @@
 </file>
 
 <file path=word/comments.xml><?xml version="1.0" encoding="utf-8"?>
-<w:comments xmlns:wpc="http://schemas.microsoft.com/office/word/2010/wordprocessingCanvas" xmlns:mc="http://schemas.openxmlformats.org/markup-compatibility/2006" xmlns:o="urn:schemas-microsoft-com:office:office" xmlns:r="http://schemas.openxmlformats.org/officeDocument/2006/relationships" xmlns:m="http://schemas.openxmlformats.org/officeDocument/2006/math" xmlns:v="urn:schemas-microsoft-com:vml" xmlns:wp="http://schemas.openxmlformats.org/drawingml/2006/wordprocessingDrawing" xmlns:w10="urn:schemas-microsoft-com:office:word" xmlns:w="http://schemas.openxmlformats.org/wordprocessingml/2006/main" xmlns:w14="http://schemas.microsoft.com/office/word/2010/wordml" xmlns:wpg="http://schemas.microsoft.com/office/word/2010/wordprocessingGroup" xmlns:wpi="http://schemas.microsoft.com/office/word/2010/wordprocessingInk" xmlns:wne="http://schemas.microsoft.com/office/word/2006/wordml" xmlns:wps="http://schemas.microsoft.com/office/word/2010/wordprocessingShape" mc:Ignorable="w14 wp14">
+<w:comments xmlns:wpc="http://schemas.microsoft.com/office/word/2010/wordprocessingCanvas" xmlns:mc="http://schemas.openxmlformats.org/markup-compatibility/2006" xmlns:o="urn:schemas-microsoft-com:office:office" xmlns:r="http://schemas.openxmlformats.org/officeDocument/2006/relationships" xmlns:m="http://schemas.openxmlformats.org/officeDocument/2006/math" xmlns:v="urn:schemas-microsoft-com:vml" xmlns:wp="http://schemas.openxmlformats.org/drawingml/2006/wordprocessingDrawing" xmlns:w10="urn:schemas-microsoft-com:office:word" xmlns:w="http://schemas.openxmlformats.org/wordprocessingml/2006/main" xmlns:w14="http://schemas.microsoft.com/office/word/2010/wordml" xmlns:w15="http://schemas.microsoft.com/office/word/2012/wordml" xmlns:wpg="http://schemas.microsoft.com/office/word/2010/wordprocessingGroup" xmlns:wpi="http://schemas.microsoft.com/office/word/2010/wordprocessingInk" xmlns:wne="http://schemas.microsoft.com/office/word/2006/wordml" xmlns:wps="http://schemas.microsoft.com/office/word/2010/wordprocessingShape" xmlns:w16cid="http://schemas.microsoft.com/office/word/2016/wordml/cid" mc:Ignorable="w14 w15 wp14 w16cid">
   <w:comment w:id="0" w:author="sara.k" w:initials="C" w:date="2026-03-05T19:36:52Z">
     <w:p>
       <w:r>
@@ -2777,6 +2777,16 @@
     </w:p>
   </w:comment>
 </w:comments>
+</file>
+
+<file path=word/commentsExtended.xml><?xml version="1.0" encoding="utf-8"?>
+<w15:commentsEx xmlns:w15="http://schemas.microsoft.com/office/word/2012/wordml" xmlns:mc="http://schemas.openxmlformats.org/markup-compatibility/2006" mc:Ignorable="w15">
+  <w15:commentEx w15:paraId="C96A0001" w15:done="0"/>
+  <w15:commentEx w15:paraId="C96A0002" w15:done="0"/>
+  <w15:commentEx w15:paraId="C96A0003" w15:done="0"/>
+  <w15:commentEx w15:paraId="C96A0004" w15:done="0"/>
+  <w15:commentEx w15:paraId="C96A0005" w15:done="0"/>
+</w15:commentsEx>
 </file>
 
 <file path=word/footer1.xml><?xml version="1.0" encoding="utf-8"?>

</xml_diff>

<commit_message>
fix: remove orphaned comments from demo DOCX
Comments 0, 1, 2, 3 had no commentRangeStart anchor in the document
body (their tracked changes were accepted but comments stayed). Google
Docs showed them as ghost comments. Stripped them from comments.xml.

Co-Authored-By: Claude Opus 4.6 (1M context) <noreply@anthropic.com>
</commit_message>
<xml_diff>
--- a/examples/vite/public/docx-editor-demo.docx
+++ b/examples/vite/public/docx-editor-demo.docx
@@ -2711,58 +2711,6 @@
 
 <file path=word/comments.xml><?xml version="1.0" encoding="utf-8"?>
 <w:comments xmlns:wpc="http://schemas.microsoft.com/office/word/2010/wordprocessingCanvas" xmlns:mc="http://schemas.openxmlformats.org/markup-compatibility/2006" xmlns:o="urn:schemas-microsoft-com:office:office" xmlns:r="http://schemas.openxmlformats.org/officeDocument/2006/relationships" xmlns:m="http://schemas.openxmlformats.org/officeDocument/2006/math" xmlns:v="urn:schemas-microsoft-com:vml" xmlns:wp="http://schemas.openxmlformats.org/drawingml/2006/wordprocessingDrawing" xmlns:w10="urn:schemas-microsoft-com:office:word" xmlns:w="http://schemas.openxmlformats.org/wordprocessingml/2006/main" xmlns:w14="http://schemas.microsoft.com/office/word/2010/wordml" xmlns:w15="http://schemas.microsoft.com/office/word/2012/wordml" xmlns:wpg="http://schemas.microsoft.com/office/word/2010/wordprocessingGroup" xmlns:wpi="http://schemas.microsoft.com/office/word/2010/wordprocessingInk" xmlns:wne="http://schemas.microsoft.com/office/word/2006/wordml" xmlns:wps="http://schemas.microsoft.com/office/word/2010/wordprocessingShape" xmlns:w16cid="http://schemas.microsoft.com/office/word/2016/wordml/cid" mc:Ignorable="w14 w15 wp14 w16cid">
-  <w:comment w:id="0" w:author="sara.k" w:initials="C" w:date="2026-03-05T19:36:52Z">
-    <w:p>
-      <w:r>
-        <w:rPr>
-          <w:rStyle w:val="CommentReference"/>
-        </w:rPr>
-        <w:annotationRef/>
-      </w:r>
-      <w:r>
-        <w:t>zero sounds a bit marketing-y. no backend required is cleaner</w:t>
-      </w:r>
-    </w:p>
-  </w:comment>
-  <w:comment w:id="3" w:author="eigenpal-jedr" w:initials="C" w:date="2026-03-05T19:36:53Z">
-    <w:p>
-      <w:r>
-        <w:rPr>
-          <w:rStyle w:val="CommentReference"/>
-        </w:rPr>
-        <w:annotationRef/>
-      </w:r>
-      <w:r>
-        <w:t>agreed, keeping your wording</w:t>
-      </w:r>
-    </w:p>
-  </w:comment>
-  <w:comment w:id="1" w:author="eigenpal-jedr" w:initials="C" w:date="2026-03-05T19:36:53Z">
-    <w:p>
-      <w:r>
-        <w:rPr>
-          <w:rStyle w:val="CommentReference"/>
-        </w:rPr>
-        <w:annotationRef/>
-      </w:r>
-      <w:r>
-        <w:t>naming the package explicitly is better for discoverability. reverting</w:t>
-      </w:r>
-    </w:p>
-  </w:comment>
-  <w:comment w:id="2" w:author="eigenpal-jedr" w:initials="C" w:date="2026-03-05T19:36:53Z">
-    <w:p>
-      <w:r>
-        <w:rPr>
-          <w:rStyle w:val="CommentReference"/>
-        </w:rPr>
-        <w:annotationRef/>
-      </w:r>
-      <w:r>
-        <w:t>NACK. not a preference. the entire tracked changes implementation depends on this. restoring.</w:t>
-      </w:r>
-    </w:p>
-  </w:comment>
   <w:comment w:id="1772738031338" w:author="User" w:date="2026-03-05T19:41:08.041Z">
     <w:p>
       <w:r>
@@ -2781,10 +2729,6 @@
 
 <file path=word/commentsExtended.xml><?xml version="1.0" encoding="utf-8"?>
 <w15:commentsEx xmlns:w15="http://schemas.microsoft.com/office/word/2012/wordml" xmlns:mc="http://schemas.openxmlformats.org/markup-compatibility/2006" mc:Ignorable="w15">
-  <w15:commentEx w15:paraId="C96A0001" w15:done="0"/>
-  <w15:commentEx w15:paraId="C96A0002" w15:done="0"/>
-  <w15:commentEx w15:paraId="C96A0003" w15:done="0"/>
-  <w15:commentEx w15:paraId="C96A0004" w15:done="0"/>
   <w15:commentEx w15:paraId="C96A0005" w15:done="0"/>
 </w15:commentsEx>
 </file>

</xml_diff>

<commit_message>
feat: serialize commentsIds.xml for Word Online reply support
Word Online needs commentsIds.xml (w16cid:commentsIds) with durableId
entries to properly display reply threads. Without it, only top-level
comments appear.

- Add serializeCommentsIds() to comment serializer
- Add content type, relationship type, and packaging helpers
- Update both rezip and selectiveSave paths
- Re-save demo DOCX with all 3 comment parts

Co-Authored-By: Claude Opus 4.6 (1M context) <noreply@anthropic.com>
</commit_message>
<xml_diff>
--- a/examples/vite/public/docx-editor-demo.docx
+++ b/examples/vite/public/docx-editor-demo.docx
@@ -2731,6 +2731,12 @@
 <w15:commentsEx xmlns:w15="http://schemas.microsoft.com/office/word/2012/wordml" xmlns:mc="http://schemas.openxmlformats.org/markup-compatibility/2006" mc:Ignorable="w15">
   <w15:commentEx w15:paraId="C96A0005" w15:done="0"/>
 </w15:commentsEx>
+</file>
+
+<file path=word/commentsIds.xml><?xml version="1.0" encoding="utf-8"?>
+<w16cid:commentsIds xmlns:w16cid="http://schemas.microsoft.com/office/word/2016/wordml/cid" xmlns:mc="http://schemas.openxmlformats.org/markup-compatibility/2006" mc:Ignorable="w16cid">
+  <w16cid:commentId w16cid:paraId="C96A0005" w16cid:durableId="C96A0005"/>
+</w16cid:commentsIds>
 </file>
 
 <file path=word/footer1.xml><?xml version="1.0" encoding="utf-8"?>

</xml_diff>

<commit_message>
fix: resolved highlight not updating + demo DOCX with correct rels
Two fixes:
1. Add resolvedCommentIds to repaint dependency array so layout-painter
   re-renders when comments are resolved/unresolved (highlight removal)
2. Re-save demo DOCX from clean main to get correct relationship types
   (old save had stale wrong commentsExtended relationship type that
   caused Word Online to reject the file)

Co-Authored-By: Claude Opus 4.6 (1M context) <noreply@anthropic.com>
</commit_message>
<xml_diff>
--- a/examples/vite/public/docx-editor-demo.docx
+++ b/examples/vite/public/docx-editor-demo.docx
@@ -2729,13 +2729,13 @@
 
 <file path=word/commentsExtended.xml><?xml version="1.0" encoding="utf-8"?>
 <w15:commentsEx xmlns:w15="http://schemas.microsoft.com/office/word/2012/wordml" xmlns:mc="http://schemas.openxmlformats.org/markup-compatibility/2006" mc:Ignorable="w15">
-  <w15:commentEx w15:paraId="C96A0005" w15:done="0"/>
+  <w15:commentEx w15:paraId="3DCA0001" w15:done="0"/>
 </w15:commentsEx>
 </file>
 
 <file path=word/commentsIds.xml><?xml version="1.0" encoding="utf-8"?>
 <w16cid:commentsIds xmlns:w16cid="http://schemas.microsoft.com/office/word/2016/wordml/cid" xmlns:mc="http://schemas.openxmlformats.org/markup-compatibility/2006" mc:Ignorable="w16cid">
-  <w16cid:commentId w16cid:paraId="C96A0005" w16cid:durableId="C96A0005"/>
+  <w16cid:commentId w16cid:paraId="3DCA0001" w16cid:durableId="3DCA0001"/>
 </w16cid:commentsIds>
 </file>
 

</xml_diff>

<commit_message>
feat: serialize commentsExtensible.xml (w16cex) for full comment fidelity
Word Online and Pages use commentsExtensible.xml for UTC timestamps on
comments. This is the 4th and final comment extension part:

1. comments.xml — main comment content
2. commentsExtended.xml (w15) — reply threading
3. commentsIds.xml (w16cid) — stable durable IDs
4. commentsExtensible.xml (w16cex) — UTC dates [NEW]

Also merges main (includes PR #220 mark-step tracking fix).

Co-Authored-By: Claude Opus 4.6 (1M context) <noreply@anthropic.com>
</commit_message>
<xml_diff>
--- a/examples/vite/public/docx-editor-demo.docx
+++ b/examples/vite/public/docx-editor-demo.docx
@@ -2729,13 +2729,19 @@
 
 <file path=word/commentsExtended.xml><?xml version="1.0" encoding="utf-8"?>
 <w15:commentsEx xmlns:w15="http://schemas.microsoft.com/office/word/2012/wordml" xmlns:mc="http://schemas.openxmlformats.org/markup-compatibility/2006" mc:Ignorable="w15">
-  <w15:commentEx w15:paraId="3DCA0001" w15:done="0"/>
+  <w15:commentEx w15:paraId="88B80001" w15:done="0"/>
 </w15:commentsEx>
+</file>
+
+<file path=word/commentsExtensible.xml><?xml version="1.0" encoding="utf-8"?>
+<w16cex:commentsExtensible xmlns:w16cex="http://schemas.microsoft.com/office/word/2018/wordml/cex" xmlns:mc="http://schemas.openxmlformats.org/markup-compatibility/2006" mc:Ignorable="w16cex">
+  <w16cex:commentExtensible w16cex:durableId="D2E25A5B" w16cex:dateUtc="2026-03-05T19:41:08.041Z"/>
+</w16cex:commentsExtensible>
 </file>
 
 <file path=word/commentsIds.xml><?xml version="1.0" encoding="utf-8"?>
 <w16cid:commentsIds xmlns:w16cid="http://schemas.microsoft.com/office/word/2016/wordml/cid" xmlns:mc="http://schemas.openxmlformats.org/markup-compatibility/2006" mc:Ignorable="w16cid">
-  <w16cid:commentId w16cid:paraId="3DCA0001" w16cid:durableId="3DCA0001"/>
+  <w16cid:commentId w16cid:paraId="88B80001" w16cid:durableId="D2E25A5B"/>
 </w16cid:commentsIds>
 </file>
 

</xml_diff>

<commit_message>
fix: remove ID truncation that caused mismatch, use small IDs at source
The truncation of large IDs in comment serializer caused a mismatch:
comments.xml got truncated IDs but document.xml (from selective save)
kept original large IDs. Comments vanished because ranges didn't match.

Fix: generate small sequential IDs at source (nextCommentId=100),
re-save demo with small ID (10), remove broken truncation code.

Co-Authored-By: Claude Opus 4.6 (1M context) <noreply@anthropic.com>
</commit_message>
<xml_diff>
--- a/examples/vite/public/docx-editor-demo.docx
+++ b/examples/vite/public/docx-editor-demo.docx
@@ -732,7 +732,7 @@
         </w:rPr>
         <w:t xml:space="preserve">Select text and click the floating button on the page edge to </w:t>
       </w:r>
-      <w:commentRangeStart w:id="1772738031338"/>
+      <w:commentRangeStart w:id="10"/>
       <w:r>
         <w:rPr>
           <w:rFonts w:ascii="Inter" w:hAnsi="Inter" w:cs="Inter"/>
@@ -742,12 +742,12 @@
         </w:rPr>
         <w:t>add a comment anchored to that selection</w:t>
       </w:r>
-      <w:commentRangeEnd w:id="1772738031338"/>
+      <w:commentRangeEnd w:id="10"/>
       <w:r>
         <w:rPr>
           <w:rStyle w:val="CommentReference"/>
         </w:rPr>
-        <w:commentReference w:id="1772738031338"/>
+        <w:commentReference w:id="10"/>
       </w:r>
       <w:r>
         <w:rPr>
@@ -2710,8 +2710,8 @@
 </file>
 
 <file path=word/comments.xml><?xml version="1.0" encoding="utf-8"?>
-<w:comments xmlns:wpc="http://schemas.microsoft.com/office/word/2010/wordprocessingCanvas" xmlns:mc="http://schemas.openxmlformats.org/markup-compatibility/2006" xmlns:o="urn:schemas-microsoft-com:office:office" xmlns:r="http://schemas.openxmlformats.org/officeDocument/2006/relationships" xmlns:m="http://schemas.openxmlformats.org/officeDocument/2006/math" xmlns:v="urn:schemas-microsoft-com:vml" xmlns:wp="http://schemas.openxmlformats.org/drawingml/2006/wordprocessingDrawing" xmlns:w10="urn:schemas-microsoft-com:office:word" xmlns:w="http://schemas.openxmlformats.org/wordprocessingml/2006/main" xmlns:w14="http://schemas.microsoft.com/office/word/2010/wordml" xmlns:w15="http://schemas.microsoft.com/office/word/2012/wordml" xmlns:wpg="http://schemas.microsoft.com/office/word/2010/wordprocessingGroup" xmlns:wpi="http://schemas.microsoft.com/office/word/2010/wordprocessingInk" xmlns:wne="http://schemas.microsoft.com/office/word/2006/wordml" xmlns:wps="http://schemas.microsoft.com/office/word/2010/wordprocessingShape" xmlns:w16cid="http://schemas.microsoft.com/office/word/2016/wordml/cid" mc:Ignorable="w14 w15 wp14 w16cid">
-  <w:comment w:id="1772738031338" w:author="User" w:date="2026-03-05T19:41:08.041Z">
+<w:comments xmlns:wpc="http://schemas.microsoft.com/office/word/2010/wordprocessingCanvas" xmlns:cx="http://schemas.microsoft.com/office/drawing/2014/chartex" xmlns:cx1="http://schemas.microsoft.com/office/drawing/2015/9/8/chartex" xmlns:cx2="http://schemas.microsoft.com/office/drawing/2015/10/21/chartex" xmlns:cx3="http://schemas.microsoft.com/office/drawing/2016/5/9/chartex" xmlns:cx4="http://schemas.microsoft.com/office/drawing/2016/5/10/chartex" xmlns:cx5="http://schemas.microsoft.com/office/drawing/2016/5/11/chartex" xmlns:cx6="http://schemas.microsoft.com/office/drawing/2016/5/12/chartex" xmlns:cx7="http://schemas.microsoft.com/office/drawing/2016/5/13/chartex" xmlns:cx8="http://schemas.microsoft.com/office/drawing/2016/5/14/chartex" xmlns:mc="http://schemas.openxmlformats.org/markup-compatibility/2006" xmlns:aink="http://schemas.microsoft.com/office/drawing/2016/ink" xmlns:am3d="http://schemas.microsoft.com/office/drawing/2017/model3d" xmlns:o="urn:schemas-microsoft-com:office:office" xmlns:oel="http://schemas.microsoft.com/office/2019/extlst" xmlns:r="http://schemas.openxmlformats.org/officeDocument/2006/relationships" xmlns:m="http://schemas.openxmlformats.org/officeDocument/2006/math" xmlns:v="urn:schemas-microsoft-com:vml" xmlns:wp14="http://schemas.microsoft.com/office/word/2010/wordprocessingDrawing" xmlns:wp="http://schemas.openxmlformats.org/drawingml/2006/wordprocessingDrawing" xmlns:w10="urn:schemas-microsoft-com:office:word" xmlns:w="http://schemas.openxmlformats.org/wordprocessingml/2006/main" xmlns:w14="http://schemas.microsoft.com/office/word/2010/wordml" xmlns:w15="http://schemas.microsoft.com/office/word/2012/wordml" xmlns:w16cex="http://schemas.microsoft.com/office/word/2018/wordml/cex" xmlns:w16cid="http://schemas.microsoft.com/office/word/2016/wordml/cid" xmlns:w16="http://schemas.microsoft.com/office/word/2018/wordml" xmlns:w16du="http://schemas.microsoft.com/office/word/2023/wordml/word16du" xmlns:w16sdtdh="http://schemas.microsoft.com/office/word/2020/wordml/sdtdatahash" xmlns:w16sdtfl="http://schemas.microsoft.com/office/word/2024/wordml/sdtformatlock" xmlns:w16se="http://schemas.microsoft.com/office/word/2015/wordml/symex" xmlns:wpg="http://schemas.microsoft.com/office/word/2010/wordprocessingGroup" xmlns:wpi="http://schemas.microsoft.com/office/word/2010/wordprocessingInk" xmlns:wne="http://schemas.microsoft.com/office/word/2006/wordml" xmlns:wps="http://schemas.microsoft.com/office/word/2010/wordprocessingShape" mc:Ignorable="w14 w15 w16se w16cid w16 w16cex w16sdtdh w16sdtfl w16du wp14">
+  <w:comment w:id="10" w:author="User" w:initials="" w:date="2026-03-05T19:41:08Z">
     <w:p>
       <w:r>
         <w:rPr>
@@ -2728,20 +2728,20 @@
 </file>
 
 <file path=word/commentsExtended.xml><?xml version="1.0" encoding="utf-8"?>
-<w15:commentsEx xmlns:w15="http://schemas.microsoft.com/office/word/2012/wordml" xmlns:mc="http://schemas.openxmlformats.org/markup-compatibility/2006" mc:Ignorable="w15">
-  <w15:commentEx w15:paraId="88B80001" w15:done="0"/>
+<w15:commentsEx xmlns:wpc="http://schemas.microsoft.com/office/word/2010/wordprocessingCanvas" xmlns:cx="http://schemas.microsoft.com/office/drawing/2014/chartex" xmlns:cx1="http://schemas.microsoft.com/office/drawing/2015/9/8/chartex" xmlns:cx2="http://schemas.microsoft.com/office/drawing/2015/10/21/chartex" xmlns:cx3="http://schemas.microsoft.com/office/drawing/2016/5/9/chartex" xmlns:cx4="http://schemas.microsoft.com/office/drawing/2016/5/10/chartex" xmlns:cx5="http://schemas.microsoft.com/office/drawing/2016/5/11/chartex" xmlns:cx6="http://schemas.microsoft.com/office/drawing/2016/5/12/chartex" xmlns:cx7="http://schemas.microsoft.com/office/drawing/2016/5/13/chartex" xmlns:cx8="http://schemas.microsoft.com/office/drawing/2016/5/14/chartex" xmlns:mc="http://schemas.openxmlformats.org/markup-compatibility/2006" xmlns:aink="http://schemas.microsoft.com/office/drawing/2016/ink" xmlns:am3d="http://schemas.microsoft.com/office/drawing/2017/model3d" xmlns:o="urn:schemas-microsoft-com:office:office" xmlns:oel="http://schemas.microsoft.com/office/2019/extlst" xmlns:r="http://schemas.openxmlformats.org/officeDocument/2006/relationships" xmlns:m="http://schemas.openxmlformats.org/officeDocument/2006/math" xmlns:v="urn:schemas-microsoft-com:vml" xmlns:wp14="http://schemas.microsoft.com/office/word/2010/wordprocessingDrawing" xmlns:wp="http://schemas.openxmlformats.org/drawingml/2006/wordprocessingDrawing" xmlns:w10="urn:schemas-microsoft-com:office:word" xmlns:w="http://schemas.openxmlformats.org/wordprocessingml/2006/main" xmlns:w14="http://schemas.microsoft.com/office/word/2010/wordml" xmlns:w15="http://schemas.microsoft.com/office/word/2012/wordml" xmlns:w16cex="http://schemas.microsoft.com/office/word/2018/wordml/cex" xmlns:w16cid="http://schemas.microsoft.com/office/word/2016/wordml/cid" xmlns:w16="http://schemas.microsoft.com/office/word/2018/wordml" xmlns:w16du="http://schemas.microsoft.com/office/word/2023/wordml/word16du" xmlns:w16sdtdh="http://schemas.microsoft.com/office/word/2020/wordml/sdtdatahash" xmlns:w16sdtfl="http://schemas.microsoft.com/office/word/2024/wordml/sdtformatlock" xmlns:w16se="http://schemas.microsoft.com/office/word/2015/wordml/symex" xmlns:wpg="http://schemas.microsoft.com/office/word/2010/wordprocessingGroup" xmlns:wpi="http://schemas.microsoft.com/office/word/2010/wordprocessingInk" xmlns:wne="http://schemas.microsoft.com/office/word/2006/wordml" xmlns:wps="http://schemas.microsoft.com/office/word/2010/wordprocessingShape" mc:Ignorable="w14 w15 w16se w16cid w16 w16cex w16sdtdh w16sdtfl w16du wp14">
+  <w15:commentEx w15:paraId="D4A80001" w15:done="0"/>
 </w15:commentsEx>
 </file>
 
 <file path=word/commentsExtensible.xml><?xml version="1.0" encoding="utf-8"?>
-<w16cex:commentsExtensible xmlns:w16cex="http://schemas.microsoft.com/office/word/2018/wordml/cex" xmlns:mc="http://schemas.openxmlformats.org/markup-compatibility/2006" mc:Ignorable="w16cex">
-  <w16cex:commentExtensible w16cex:durableId="D2E25A5B" w16cex:dateUtc="2026-03-05T19:41:08.041Z"/>
+<w16cex:commentsExtensible xmlns:wpc="http://schemas.microsoft.com/office/word/2010/wordprocessingCanvas" xmlns:cx="http://schemas.microsoft.com/office/drawing/2014/chartex" xmlns:cx1="http://schemas.microsoft.com/office/drawing/2015/9/8/chartex" xmlns:cx2="http://schemas.microsoft.com/office/drawing/2015/10/21/chartex" xmlns:cx3="http://schemas.microsoft.com/office/drawing/2016/5/9/chartex" xmlns:cx4="http://schemas.microsoft.com/office/drawing/2016/5/10/chartex" xmlns:cx5="http://schemas.microsoft.com/office/drawing/2016/5/11/chartex" xmlns:cx6="http://schemas.microsoft.com/office/drawing/2016/5/12/chartex" xmlns:cx7="http://schemas.microsoft.com/office/drawing/2016/5/13/chartex" xmlns:cx8="http://schemas.microsoft.com/office/drawing/2016/5/14/chartex" xmlns:mc="http://schemas.openxmlformats.org/markup-compatibility/2006" xmlns:aink="http://schemas.microsoft.com/office/drawing/2016/ink" xmlns:am3d="http://schemas.microsoft.com/office/drawing/2017/model3d" xmlns:o="urn:schemas-microsoft-com:office:office" xmlns:oel="http://schemas.microsoft.com/office/2019/extlst" xmlns:r="http://schemas.openxmlformats.org/officeDocument/2006/relationships" xmlns:m="http://schemas.openxmlformats.org/officeDocument/2006/math" xmlns:v="urn:schemas-microsoft-com:vml" xmlns:wp14="http://schemas.microsoft.com/office/word/2010/wordprocessingDrawing" xmlns:wp="http://schemas.openxmlformats.org/drawingml/2006/wordprocessingDrawing" xmlns:w10="urn:schemas-microsoft-com:office:word" xmlns:w="http://schemas.openxmlformats.org/wordprocessingml/2006/main" xmlns:w14="http://schemas.microsoft.com/office/word/2010/wordml" xmlns:w15="http://schemas.microsoft.com/office/word/2012/wordml" xmlns:w16cex="http://schemas.microsoft.com/office/word/2018/wordml/cex" xmlns:w16cid="http://schemas.microsoft.com/office/word/2016/wordml/cid" xmlns:w16="http://schemas.microsoft.com/office/word/2018/wordml" xmlns:w16du="http://schemas.microsoft.com/office/word/2023/wordml/word16du" xmlns:w16sdtdh="http://schemas.microsoft.com/office/word/2020/wordml/sdtdatahash" xmlns:w16sdtfl="http://schemas.microsoft.com/office/word/2024/wordml/sdtformatlock" xmlns:w16se="http://schemas.microsoft.com/office/word/2015/wordml/symex" xmlns:wpg="http://schemas.microsoft.com/office/word/2010/wordprocessingGroup" xmlns:wpi="http://schemas.microsoft.com/office/word/2010/wordprocessingInk" xmlns:wne="http://schemas.microsoft.com/office/word/2006/wordml" xmlns:wps="http://schemas.microsoft.com/office/word/2010/wordprocessingShape" mc:Ignorable="w14 w15 w16se w16cid w16 w16cex w16sdtdh w16sdtfl w16du wp14">
+  <w16cex:commentExtensible w16cex:durableId="D4A80002" w16cex:dateUtc="2026-03-05T19:41:08Z"/>
 </w16cex:commentsExtensible>
 </file>
 
 <file path=word/commentsIds.xml><?xml version="1.0" encoding="utf-8"?>
-<w16cid:commentsIds xmlns:w16cid="http://schemas.microsoft.com/office/word/2016/wordml/cid" xmlns:mc="http://schemas.openxmlformats.org/markup-compatibility/2006" mc:Ignorable="w16cid">
-  <w16cid:commentId w16cid:paraId="88B80001" w16cid:durableId="D2E25A5B"/>
+<w16cid:commentsIds xmlns:wpc="http://schemas.microsoft.com/office/word/2010/wordprocessingCanvas" xmlns:cx="http://schemas.microsoft.com/office/drawing/2014/chartex" xmlns:cx1="http://schemas.microsoft.com/office/drawing/2015/9/8/chartex" xmlns:cx2="http://schemas.microsoft.com/office/drawing/2015/10/21/chartex" xmlns:cx3="http://schemas.microsoft.com/office/drawing/2016/5/9/chartex" xmlns:cx4="http://schemas.microsoft.com/office/drawing/2016/5/10/chartex" xmlns:cx5="http://schemas.microsoft.com/office/drawing/2016/5/11/chartex" xmlns:cx6="http://schemas.microsoft.com/office/drawing/2016/5/12/chartex" xmlns:cx7="http://schemas.microsoft.com/office/drawing/2016/5/13/chartex" xmlns:cx8="http://schemas.microsoft.com/office/drawing/2016/5/14/chartex" xmlns:mc="http://schemas.openxmlformats.org/markup-compatibility/2006" xmlns:aink="http://schemas.microsoft.com/office/drawing/2016/ink" xmlns:am3d="http://schemas.microsoft.com/office/drawing/2017/model3d" xmlns:o="urn:schemas-microsoft-com:office:office" xmlns:oel="http://schemas.microsoft.com/office/2019/extlst" xmlns:r="http://schemas.openxmlformats.org/officeDocument/2006/relationships" xmlns:m="http://schemas.openxmlformats.org/officeDocument/2006/math" xmlns:v="urn:schemas-microsoft-com:vml" xmlns:wp14="http://schemas.microsoft.com/office/word/2010/wordprocessingDrawing" xmlns:wp="http://schemas.openxmlformats.org/drawingml/2006/wordprocessingDrawing" xmlns:w10="urn:schemas-microsoft-com:office:word" xmlns:w="http://schemas.openxmlformats.org/wordprocessingml/2006/main" xmlns:w14="http://schemas.microsoft.com/office/word/2010/wordml" xmlns:w15="http://schemas.microsoft.com/office/word/2012/wordml" xmlns:w16cex="http://schemas.microsoft.com/office/word/2018/wordml/cex" xmlns:w16cid="http://schemas.microsoft.com/office/word/2016/wordml/cid" xmlns:w16="http://schemas.microsoft.com/office/word/2018/wordml" xmlns:w16du="http://schemas.microsoft.com/office/word/2023/wordml/word16du" xmlns:w16sdtdh="http://schemas.microsoft.com/office/word/2020/wordml/sdtdatahash" xmlns:w16sdtfl="http://schemas.microsoft.com/office/word/2024/wordml/sdtformatlock" xmlns:w16se="http://schemas.microsoft.com/office/word/2015/wordml/symex" xmlns:wpg="http://schemas.microsoft.com/office/word/2010/wordprocessingGroup" xmlns:wpi="http://schemas.microsoft.com/office/word/2010/wordprocessingInk" xmlns:wne="http://schemas.microsoft.com/office/word/2006/wordml" xmlns:wps="http://schemas.microsoft.com/office/word/2010/wordprocessingShape" mc:Ignorable="w14 w15 w16se w16cid w16 w16cex w16sdtdh w16sdtfl w16du wp14">
+  <w16cid:commentId w16cid:paraId="D4A80001" w16cid:durableId="D4A80002"/>
 </w16cid:commentsIds>
 </file>
 

</xml_diff>

<commit_message>
fix: comment ID collision with tracked change revisionIds
The demo file had comment id=10 which collided with tracked change
revisionId=10. Replying to the TC attached the reply to the wrong
parent (the comment instead of the TC).

Fix: re-save demo with comment id=100, start nextCommentId at 200
to avoid collision range with TC revisionIds (typically 1-50).

Co-Authored-By: Claude Opus 4.6 (1M context) <noreply@anthropic.com>
</commit_message>
<xml_diff>
--- a/examples/vite/public/docx-editor-demo.docx
+++ b/examples/vite/public/docx-editor-demo.docx
@@ -732,7 +732,7 @@
         </w:rPr>
         <w:t xml:space="preserve">Select text and click the floating button on the page edge to </w:t>
       </w:r>
-      <w:commentRangeStart w:id="10"/>
+      <w:commentRangeStart w:id="100"/>
       <w:r>
         <w:rPr>
           <w:rFonts w:ascii="Inter" w:hAnsi="Inter" w:cs="Inter"/>
@@ -742,12 +742,12 @@
         </w:rPr>
         <w:t>add a comment anchored to that selection</w:t>
       </w:r>
-      <w:commentRangeEnd w:id="10"/>
+      <w:commentRangeEnd w:id="100"/>
       <w:r>
         <w:rPr>
           <w:rStyle w:val="CommentReference"/>
         </w:rPr>
-        <w:commentReference w:id="10"/>
+        <w:commentReference w:id="100"/>
       </w:r>
       <w:r>
         <w:rPr>
@@ -2711,7 +2711,7 @@
 
 <file path=word/comments.xml><?xml version="1.0" encoding="utf-8"?>
 <w:comments xmlns:wpc="http://schemas.microsoft.com/office/word/2010/wordprocessingCanvas" xmlns:cx="http://schemas.microsoft.com/office/drawing/2014/chartex" xmlns:cx1="http://schemas.microsoft.com/office/drawing/2015/9/8/chartex" xmlns:cx2="http://schemas.microsoft.com/office/drawing/2015/10/21/chartex" xmlns:cx3="http://schemas.microsoft.com/office/drawing/2016/5/9/chartex" xmlns:cx4="http://schemas.microsoft.com/office/drawing/2016/5/10/chartex" xmlns:cx5="http://schemas.microsoft.com/office/drawing/2016/5/11/chartex" xmlns:cx6="http://schemas.microsoft.com/office/drawing/2016/5/12/chartex" xmlns:cx7="http://schemas.microsoft.com/office/drawing/2016/5/13/chartex" xmlns:cx8="http://schemas.microsoft.com/office/drawing/2016/5/14/chartex" xmlns:mc="http://schemas.openxmlformats.org/markup-compatibility/2006" xmlns:aink="http://schemas.microsoft.com/office/drawing/2016/ink" xmlns:am3d="http://schemas.microsoft.com/office/drawing/2017/model3d" xmlns:o="urn:schemas-microsoft-com:office:office" xmlns:oel="http://schemas.microsoft.com/office/2019/extlst" xmlns:r="http://schemas.openxmlformats.org/officeDocument/2006/relationships" xmlns:m="http://schemas.openxmlformats.org/officeDocument/2006/math" xmlns:v="urn:schemas-microsoft-com:vml" xmlns:wp14="http://schemas.microsoft.com/office/word/2010/wordprocessingDrawing" xmlns:wp="http://schemas.openxmlformats.org/drawingml/2006/wordprocessingDrawing" xmlns:w10="urn:schemas-microsoft-com:office:word" xmlns:w="http://schemas.openxmlformats.org/wordprocessingml/2006/main" xmlns:w14="http://schemas.microsoft.com/office/word/2010/wordml" xmlns:w15="http://schemas.microsoft.com/office/word/2012/wordml" xmlns:w16cex="http://schemas.microsoft.com/office/word/2018/wordml/cex" xmlns:w16cid="http://schemas.microsoft.com/office/word/2016/wordml/cid" xmlns:w16="http://schemas.microsoft.com/office/word/2018/wordml" xmlns:w16du="http://schemas.microsoft.com/office/word/2023/wordml/word16du" xmlns:w16sdtdh="http://schemas.microsoft.com/office/word/2020/wordml/sdtdatahash" xmlns:w16sdtfl="http://schemas.microsoft.com/office/word/2024/wordml/sdtformatlock" xmlns:w16se="http://schemas.microsoft.com/office/word/2015/wordml/symex" xmlns:wpg="http://schemas.microsoft.com/office/word/2010/wordprocessingGroup" xmlns:wpi="http://schemas.microsoft.com/office/word/2010/wordprocessingInk" xmlns:wne="http://schemas.microsoft.com/office/word/2006/wordml" xmlns:wps="http://schemas.microsoft.com/office/word/2010/wordprocessingShape" mc:Ignorable="w14 w15 w16se w16cid w16 w16cex w16sdtdh w16sdtfl w16du wp14">
-  <w:comment w:id="10" w:author="User" w:initials="" w:date="2026-03-05T19:41:08Z">
+  <w:comment w:id="100" w:author="User" w:initials="" w:date="2026-03-05T19:41:08Z">
     <w:p>
       <w:r>
         <w:rPr>
@@ -2729,19 +2729,19 @@
 
 <file path=word/commentsExtended.xml><?xml version="1.0" encoding="utf-8"?>
 <w15:commentsEx xmlns:wpc="http://schemas.microsoft.com/office/word/2010/wordprocessingCanvas" xmlns:cx="http://schemas.microsoft.com/office/drawing/2014/chartex" xmlns:cx1="http://schemas.microsoft.com/office/drawing/2015/9/8/chartex" xmlns:cx2="http://schemas.microsoft.com/office/drawing/2015/10/21/chartex" xmlns:cx3="http://schemas.microsoft.com/office/drawing/2016/5/9/chartex" xmlns:cx4="http://schemas.microsoft.com/office/drawing/2016/5/10/chartex" xmlns:cx5="http://schemas.microsoft.com/office/drawing/2016/5/11/chartex" xmlns:cx6="http://schemas.microsoft.com/office/drawing/2016/5/12/chartex" xmlns:cx7="http://schemas.microsoft.com/office/drawing/2016/5/13/chartex" xmlns:cx8="http://schemas.microsoft.com/office/drawing/2016/5/14/chartex" xmlns:mc="http://schemas.openxmlformats.org/markup-compatibility/2006" xmlns:aink="http://schemas.microsoft.com/office/drawing/2016/ink" xmlns:am3d="http://schemas.microsoft.com/office/drawing/2017/model3d" xmlns:o="urn:schemas-microsoft-com:office:office" xmlns:oel="http://schemas.microsoft.com/office/2019/extlst" xmlns:r="http://schemas.openxmlformats.org/officeDocument/2006/relationships" xmlns:m="http://schemas.openxmlformats.org/officeDocument/2006/math" xmlns:v="urn:schemas-microsoft-com:vml" xmlns:wp14="http://schemas.microsoft.com/office/word/2010/wordprocessingDrawing" xmlns:wp="http://schemas.openxmlformats.org/drawingml/2006/wordprocessingDrawing" xmlns:w10="urn:schemas-microsoft-com:office:word" xmlns:w="http://schemas.openxmlformats.org/wordprocessingml/2006/main" xmlns:w14="http://schemas.microsoft.com/office/word/2010/wordml" xmlns:w15="http://schemas.microsoft.com/office/word/2012/wordml" xmlns:w16cex="http://schemas.microsoft.com/office/word/2018/wordml/cex" xmlns:w16cid="http://schemas.microsoft.com/office/word/2016/wordml/cid" xmlns:w16="http://schemas.microsoft.com/office/word/2018/wordml" xmlns:w16du="http://schemas.microsoft.com/office/word/2023/wordml/word16du" xmlns:w16sdtdh="http://schemas.microsoft.com/office/word/2020/wordml/sdtdatahash" xmlns:w16sdtfl="http://schemas.microsoft.com/office/word/2024/wordml/sdtformatlock" xmlns:w16se="http://schemas.microsoft.com/office/word/2015/wordml/symex" xmlns:wpg="http://schemas.microsoft.com/office/word/2010/wordprocessingGroup" xmlns:wpi="http://schemas.microsoft.com/office/word/2010/wordprocessingInk" xmlns:wne="http://schemas.microsoft.com/office/word/2006/wordml" xmlns:wps="http://schemas.microsoft.com/office/word/2010/wordprocessingShape" mc:Ignorable="w14 w15 w16se w16cid w16 w16cex w16sdtdh w16sdtfl w16du wp14">
-  <w15:commentEx w15:paraId="D4A80001" w15:done="0"/>
+  <w15:commentEx w15:paraId="2D0288BE" w15:done="0"/>
 </w15:commentsEx>
 </file>
 
 <file path=word/commentsExtensible.xml><?xml version="1.0" encoding="utf-8"?>
 <w16cex:commentsExtensible xmlns:wpc="http://schemas.microsoft.com/office/word/2010/wordprocessingCanvas" xmlns:cx="http://schemas.microsoft.com/office/drawing/2014/chartex" xmlns:cx1="http://schemas.microsoft.com/office/drawing/2015/9/8/chartex" xmlns:cx2="http://schemas.microsoft.com/office/drawing/2015/10/21/chartex" xmlns:cx3="http://schemas.microsoft.com/office/drawing/2016/5/9/chartex" xmlns:cx4="http://schemas.microsoft.com/office/drawing/2016/5/10/chartex" xmlns:cx5="http://schemas.microsoft.com/office/drawing/2016/5/11/chartex" xmlns:cx6="http://schemas.microsoft.com/office/drawing/2016/5/12/chartex" xmlns:cx7="http://schemas.microsoft.com/office/drawing/2016/5/13/chartex" xmlns:cx8="http://schemas.microsoft.com/office/drawing/2016/5/14/chartex" xmlns:mc="http://schemas.openxmlformats.org/markup-compatibility/2006" xmlns:aink="http://schemas.microsoft.com/office/drawing/2016/ink" xmlns:am3d="http://schemas.microsoft.com/office/drawing/2017/model3d" xmlns:o="urn:schemas-microsoft-com:office:office" xmlns:oel="http://schemas.microsoft.com/office/2019/extlst" xmlns:r="http://schemas.openxmlformats.org/officeDocument/2006/relationships" xmlns:m="http://schemas.openxmlformats.org/officeDocument/2006/math" xmlns:v="urn:schemas-microsoft-com:vml" xmlns:wp14="http://schemas.microsoft.com/office/word/2010/wordprocessingDrawing" xmlns:wp="http://schemas.openxmlformats.org/drawingml/2006/wordprocessingDrawing" xmlns:w10="urn:schemas-microsoft-com:office:word" xmlns:w="http://schemas.openxmlformats.org/wordprocessingml/2006/main" xmlns:w14="http://schemas.microsoft.com/office/word/2010/wordml" xmlns:w15="http://schemas.microsoft.com/office/word/2012/wordml" xmlns:w16cex="http://schemas.microsoft.com/office/word/2018/wordml/cex" xmlns:w16cid="http://schemas.microsoft.com/office/word/2016/wordml/cid" xmlns:w16="http://schemas.microsoft.com/office/word/2018/wordml" xmlns:w16du="http://schemas.microsoft.com/office/word/2023/wordml/word16du" xmlns:w16sdtdh="http://schemas.microsoft.com/office/word/2020/wordml/sdtdatahash" xmlns:w16sdtfl="http://schemas.microsoft.com/office/word/2024/wordml/sdtformatlock" xmlns:w16se="http://schemas.microsoft.com/office/word/2015/wordml/symex" xmlns:wpg="http://schemas.microsoft.com/office/word/2010/wordprocessingGroup" xmlns:wpi="http://schemas.microsoft.com/office/word/2010/wordprocessingInk" xmlns:wne="http://schemas.microsoft.com/office/word/2006/wordml" xmlns:wps="http://schemas.microsoft.com/office/word/2010/wordprocessingShape" mc:Ignorable="w14 w15 w16se w16cid w16 w16cex w16sdtdh w16sdtfl w16du wp14">
-  <w16cex:commentExtensible w16cex:durableId="D4A80002" w16cex:dateUtc="2026-03-05T19:41:08Z"/>
+  <w16cex:commentExtensible w16cex:durableId="1B0728B5" w16cex:dateUtc="2026-03-05T19:41:08Z"/>
 </w16cex:commentsExtensible>
 </file>
 
 <file path=word/commentsIds.xml><?xml version="1.0" encoding="utf-8"?>
 <w16cid:commentsIds xmlns:wpc="http://schemas.microsoft.com/office/word/2010/wordprocessingCanvas" xmlns:cx="http://schemas.microsoft.com/office/drawing/2014/chartex" xmlns:cx1="http://schemas.microsoft.com/office/drawing/2015/9/8/chartex" xmlns:cx2="http://schemas.microsoft.com/office/drawing/2015/10/21/chartex" xmlns:cx3="http://schemas.microsoft.com/office/drawing/2016/5/9/chartex" xmlns:cx4="http://schemas.microsoft.com/office/drawing/2016/5/10/chartex" xmlns:cx5="http://schemas.microsoft.com/office/drawing/2016/5/11/chartex" xmlns:cx6="http://schemas.microsoft.com/office/drawing/2016/5/12/chartex" xmlns:cx7="http://schemas.microsoft.com/office/drawing/2016/5/13/chartex" xmlns:cx8="http://schemas.microsoft.com/office/drawing/2016/5/14/chartex" xmlns:mc="http://schemas.openxmlformats.org/markup-compatibility/2006" xmlns:aink="http://schemas.microsoft.com/office/drawing/2016/ink" xmlns:am3d="http://schemas.microsoft.com/office/drawing/2017/model3d" xmlns:o="urn:schemas-microsoft-com:office:office" xmlns:oel="http://schemas.microsoft.com/office/2019/extlst" xmlns:r="http://schemas.openxmlformats.org/officeDocument/2006/relationships" xmlns:m="http://schemas.openxmlformats.org/officeDocument/2006/math" xmlns:v="urn:schemas-microsoft-com:vml" xmlns:wp14="http://schemas.microsoft.com/office/word/2010/wordprocessingDrawing" xmlns:wp="http://schemas.openxmlformats.org/drawingml/2006/wordprocessingDrawing" xmlns:w10="urn:schemas-microsoft-com:office:word" xmlns:w="http://schemas.openxmlformats.org/wordprocessingml/2006/main" xmlns:w14="http://schemas.microsoft.com/office/word/2010/wordml" xmlns:w15="http://schemas.microsoft.com/office/word/2012/wordml" xmlns:w16cex="http://schemas.microsoft.com/office/word/2018/wordml/cex" xmlns:w16cid="http://schemas.microsoft.com/office/word/2016/wordml/cid" xmlns:w16="http://schemas.microsoft.com/office/word/2018/wordml" xmlns:w16du="http://schemas.microsoft.com/office/word/2023/wordml/word16du" xmlns:w16sdtdh="http://schemas.microsoft.com/office/word/2020/wordml/sdtdatahash" xmlns:w16sdtfl="http://schemas.microsoft.com/office/word/2024/wordml/sdtformatlock" xmlns:w16se="http://schemas.microsoft.com/office/word/2015/wordml/symex" xmlns:wpg="http://schemas.microsoft.com/office/word/2010/wordprocessingGroup" xmlns:wpi="http://schemas.microsoft.com/office/word/2010/wordprocessingInk" xmlns:wne="http://schemas.microsoft.com/office/word/2006/wordml" xmlns:wps="http://schemas.microsoft.com/office/word/2010/wordprocessingShape" mc:Ignorable="w14 w15 w16se w16cid w16 w16cex w16sdtdh w16sdtfl w16du wp14">
-  <w16cid:commentId w16cid:paraId="D4A80001" w16cid:durableId="D4A80002"/>
+  <w16cid:commentId w16cid:paraId="2D0288BE" w16cid:durableId="1B0728B5"/>
 </w16cid:commentsIds>
 </file>
 

</xml_diff>